<commit_message>
fix(cd2): reconcile P8 sample size to the reproducible canonical (1.450)
Resolve the flagged P8 N discrepancy. CĐ2 §2.4.3 reported a stale pooled N=1.371
(and "209 complete-case") from a pre-redesign build; the dissertation uses 1.450
in seven places and the committed runner reproduces it live:
  p8/replication/build_and_run_p8_7pacific.py -> N=1450, 7 clusters,
  212 exporters (14.6%), mean FSTS=0.054.
Update the line to the verified figures (pooled N=1.450; 212 exporters, 14.6%)
and caveat the −1.339 coefficient as the illustrative three-cluster build rather
than asserting p<.001 — consistent with §2.3.8 Đóng góp 4 and the dissertation.
Evidence-grounded reconciliation (live reproduction + cross-document parity),
not a manual number change. CĐ2 recompiles cleanly; package CD2 rebuilt.

Co-Authored-By: Claude Opus 4.8 (1M context) <noreply@anthropic.com>
Claude-Session: https://claude.ai/code/session_01Xumaoraa2DLWLXsgJJ62oq
</commit_message>
<xml_diff>
--- a/dist/BO_NOP_HOAN_CHINH_2026-06/2_chuyen_de/CD2_CTU.docx
+++ b/dist/BO_NOP_HOAN_CHINH_2026-06/2_chuyen_de/CD2_CTU.docx
@@ -12932,13 +12932,13 @@
           <w:bCs/>
           <w:b/>
         </w:rPr>
-        <w:t xml:space="preserve">mẫu chính 7 nền Pacific SIDS (N=209 complete-case; mẫu gộp 1.371), β(FSTS_c)=−1,339</w:t>
-      </w:r>
-      <w:r>
-        <w:t xml:space="preserve"> </w:t>
-      </w:r>
-      <w:r>
-        <w:t xml:space="preserve">(p&lt;.001); kiểm định độ vững mở rộng 9 nền (thêm Comoros + Timor-Leste, N≈1.469, β≈−0,4), minh họa cho gánh nặng quốc tế hóa cưỡng bức như trường hợp giới hạn lý thuyết (trên mẫu đầy đủ 7 nền, dạng chữ U ngược mất cấu trúc; hệ số âm mạnh chỉ ở bản dựng hạn chế ba cụm), nhất quán với giả thuyết gánh nặng bắt buộc (Briguglio, 1995; Bertram, 2006). Khoảng trống về điều kiện biên FIP (Nhóm VI SIDS) trong CĐ2 đã được lấp đầy bởi P8.</w:t>
+        <w:t xml:space="preserve">mẫu chính 7 nền Pacific SIDS (mẫu gộp N = 1.450; 212 cơ sở có xuất khẩu, 14,6%), β(FSTS_c) = −1,339</w:t>
+      </w:r>
+      <w:r>
+        <w:t xml:space="preserve"> </w:t>
+      </w:r>
+      <w:r>
+        <w:t xml:space="preserve">(bản dựng ba cụm, minh họa); kiểm định độ vững mở rộng 9 nền (thêm Comoros + Timor-Leste, N≈1.469, β≈−0,4), minh họa cho gánh nặng quốc tế hóa cưỡng bức như trường hợp giới hạn lý thuyết (trên mẫu đầy đủ 7 nền, dạng chữ U ngược mất cấu trúc; hệ số âm mạnh chỉ ở bản dựng hạn chế ba cụm), nhất quán với giả thuyết gánh nặng bắt buộc (Briguglio, 1995; Bertram, 2006). Khoảng trống về điều kiện biên FIP (Nhóm VI SIDS) trong CĐ2 đã được lấp đầy bởi P8.</w:t>
       </w:r>
     </w:p>
     <w:p>

</xml_diff>